<commit_message>
Mejora para visualizar candidatos de vacante
</commit_message>
<xml_diff>
--- a/docs/Antares_Arquitectura_UI_UX.docx
+++ b/docs/Antares_Arquitectura_UI_UX.docx
@@ -2,6 +2,50 @@
 <file path=word/document.xml><?xml version="1.0" encoding="utf-8"?>
 <w:document xmlns:wpc="http://schemas.microsoft.com/office/word/2010/wordprocessingCanvas" xmlns:mo="http://schemas.microsoft.com/office/mac/office/2008/main" xmlns:mc="http://schemas.openxmlformats.org/markup-compatibility/2006" xmlns:mv="urn:schemas-microsoft-com:mac:vml" xmlns:o="urn:schemas-microsoft-com:office:office" xmlns:r="http://schemas.openxmlformats.org/officeDocument/2006/relationships" xmlns:m="http://schemas.openxmlformats.org/officeDocument/2006/math" xmlns:v="urn:schemas-microsoft-com:vml" xmlns:wp14="http://schemas.microsoft.com/office/word/2010/wordprocessingDrawing" xmlns:wp="http://schemas.openxmlformats.org/drawingml/2006/wordprocessingDrawing" xmlns:w10="urn:schemas-microsoft-com:office:word" xmlns:w="http://schemas.openxmlformats.org/wordprocessingml/2006/main" xmlns:w14="http://schemas.microsoft.com/office/word/2010/wordml" xmlns:wpg="http://schemas.microsoft.com/office/word/2010/wordprocessingGroup" xmlns:wpi="http://schemas.microsoft.com/office/word/2010/wordprocessingInk" xmlns:wne="http://schemas.microsoft.com/office/word/2006/wordml" xmlns:wps="http://schemas.microsoft.com/office/word/2010/wordprocessingShape" mc:Ignorable="w14 wp14">
   <w:body>
+    <w:p/>
+    <w:p/>
+    <w:p/>
+    <w:p/>
+    <w:p>
+      <w:pPr>
+        <w:spacing w:after="240"/>
+        <w:jc w:val="center"/>
+      </w:pPr>
+      <w:r>
+        <w:drawing>
+          <wp:inline xmlns:a="http://schemas.openxmlformats.org/drawingml/2006/main" xmlns:pic="http://schemas.openxmlformats.org/drawingml/2006/picture">
+            <wp:extent cx="3611880" cy="2790998"/>
+            <wp:docPr id="1" name="Picture 1"/>
+            <wp:cNvGraphicFramePr>
+              <a:graphicFrameLocks noChangeAspect="1"/>
+            </wp:cNvGraphicFramePr>
+            <a:graphic>
+              <a:graphicData uri="http://schemas.openxmlformats.org/drawingml/2006/picture">
+                <pic:pic>
+                  <pic:nvPicPr>
+                    <pic:cNvPr id="0" name="Logo.png"/>
+                    <pic:cNvPicPr/>
+                  </pic:nvPicPr>
+                  <pic:blipFill>
+                    <a:blip r:embed="rId9"/>
+                    <a:stretch>
+                      <a:fillRect/>
+                    </a:stretch>
+                  </pic:blipFill>
+                  <pic:spPr>
+                    <a:xfrm>
+                      <a:off x="0" y="0"/>
+                      <a:ext cx="3611880" cy="2790998"/>
+                    </a:xfrm>
+                    <a:prstGeom prst="rect"/>
+                  </pic:spPr>
+                </pic:pic>
+              </a:graphicData>
+            </a:graphic>
+          </wp:inline>
+        </w:drawing>
+      </w:r>
+    </w:p>
     <w:p>
       <w:pPr>
         <w:jc w:val="center"/>
@@ -9,35 +53,72 @@
       <w:r>
         <w:rPr>
           <w:b/>
-          <w:sz w:val="34"/>
+          <w:sz w:val="44"/>
         </w:rPr>
-        <w:t>Transportes Antares S.A.S</w:t>
-        <w:br/>
-        <w:t>Arquitectura de software — Sistema de diseño UI/UX</w:t>
-        <w:br/>
-        <w:t>Modelo de datos y mockups de referencia</w:t>
+        <w:t>TRANSPORTES ANTARES S.A.S</w:t>
       </w:r>
     </w:p>
     <w:p>
+      <w:pPr>
+        <w:jc w:val="center"/>
+      </w:pPr>
+      <w:r>
+        <w:rPr>
+          <w:b/>
+          <w:sz w:val="29"/>
+        </w:rPr>
+        <w:t>Solución digital — Documento de arquitectura técnica (AS-IS)</w:t>
+      </w:r>
+    </w:p>
+    <w:p>
+      <w:pPr>
+        <w:jc w:val="center"/>
+      </w:pPr>
       <w:r>
         <w:rPr>
           <w:b w:val="0"/>
           <w:sz w:val="22"/>
         </w:rPr>
-        <w:t>Documento descriptivo del estado actual del repositorio Antares Nuevo (sitio público SPA, portal operativo integrado y API NestJS). Fuente código: `C:\Users\User\Documents\Antares Nuevo`</w:t>
+        <w:t>Vistas contextuales, contenedores, despliegue, dominio datos y sistema de diseño UX/UI</w:t>
       </w:r>
     </w:p>
     <w:p>
+      <w:pPr>
+        <w:jc w:val="center"/>
+      </w:pPr>
       <w:r>
         <w:rPr>
           <w:b w:val="0"/>
+          <w:sz w:val="21"/>
+        </w:rPr>
+        <w:t>Presentación institucional para validación cliente / equipo de arquitectura empresarial</w:t>
+      </w:r>
+    </w:p>
+    <w:p/>
+    <w:p/>
+    <w:p>
+      <w:pPr>
+        <w:jc w:val="center"/>
+      </w:pPr>
+      <w:r>
+        <w:rPr>
+          <w:b/>
+          <w:color w:val="D62828"/>
           <w:sz w:val="22"/>
         </w:rPr>
+        <w:t>CONFIDENCIAL — Uso corporativo por destinatarios autorizados</w:t>
       </w:r>
     </w:p>
     <w:p>
+      <w:pPr>
+        <w:jc w:val="center"/>
+      </w:pPr>
       <w:r>
-        <w:t>Versión: 1.0 — referencia técnica y de producto para stakeholders y desarrollo.</w:t>
+        <w:rPr>
+          <w:i/>
+          <w:sz w:val="20"/>
+        </w:rPr>
+        <w:t>Mayo de 2026 — Versión reproducible automatizada desde repositorio</w:t>
       </w:r>
     </w:p>
     <w:p>
@@ -50,80 +131,7 @@
         <w:pStyle w:val="Heading1"/>
       </w:pPr>
       <w:r>
-        <w:t>1. Alcance del producto</w:t>
-      </w:r>
-    </w:p>
-    <w:p>
-      <w:r>
-        <w:rPr>
-          <w:b w:val="0"/>
-          <w:sz w:val="22"/>
-        </w:rPr>
-        <w:t>Dos caras coherentes sobre la misma identidad corporativa: (a) página de marca y captación B2B con formulario de contacto y contenido institucional; (b) portal autenticado para clientes y equipo interno según rol, con flujos operativos (solicitudes de transporte, flota, nómina, RRHH y aprobaciones). El front principal vive como aplicación contenida en `index.html`, `styles.css` y `app.js` (~Vanilla JS) con tema claro/oscuro e internacionalización (ES/en). Una API opcional en `apps/api` (NestJS) persiste contra PostgreSQL (Supabase/Render).</w:t>
-      </w:r>
-    </w:p>
-    <w:p>
-      <w:pPr>
-        <w:pStyle w:val="Heading1"/>
-      </w:pPr>
-      <w:r>
-        <w:t>2. Vista de arquitectura técnica</w:t>
-      </w:r>
-    </w:p>
-    <w:p>
-      <w:pPr>
-        <w:pStyle w:val="Heading2"/>
-      </w:pPr>
-      <w:r>
-        <w:t>2.1 Diagrama lógico (componentes)</w:t>
-      </w:r>
-    </w:p>
-    <w:p>
-      <w:r>
-        <w:rPr>
-          <w:rFonts w:ascii="Consolas" w:hAnsi="Consolas"/>
-          <w:sz w:val="20"/>
-        </w:rPr>
-        <w:t xml:space="preserve">  [Visitante / Usuario navegador]</w:t>
-        <w:br/>
-        <w:t xml:space="preserve">            |  HTTPS + CSP meta (Turnstile, fuentes Google)</w:t>
-        <w:br/>
-        <w:t xml:space="preserve">            v</w:t>
-        <w:br/>
-        <w:t xml:space="preserve">      +-----------+       JWT /cookies        +------------------+</w:t>
-        <w:br/>
-        <w:t xml:space="preserve">      | index.html | &lt;----------------------&gt; | NestJS api (4000)|</w:t>
-        <w:br/>
-        <w:t xml:space="preserve">      | app.js    |    /api/auth, /portal/... | AppModule       |</w:t>
-        <w:br/>
-        <w:t xml:space="preserve">      +-----------+                          +--------+---------+</w:t>
-        <w:br/>
-        <w:t xml:space="preserve">            | POST sync /bootstrap                      |</w:t>
-        <w:br/>
-        <w:t xml:space="preserve">            | localStorage KEYS.*                       | pg Pool</w:t>
-        <w:br/>
-        <w:t xml:space="preserve">            v                                           v</w:t>
-        <w:br/>
-        <w:t xml:space="preserve">      [localStorage borrador ]              [PostgreSQL - esquema public]</w:t>
-        <w:br/>
-        <w:t xml:space="preserve">                                                       Supabase opcional</w:t>
-      </w:r>
-    </w:p>
-    <w:p>
-      <w:r>
-        <w:rPr>
-          <w:b w:val="0"/>
-          <w:sz w:val="22"/>
-        </w:rPr>
-        <w:t>Los datos del portal pueden operar offline-first mediante `localStorage` y escritura al servidor cuando la API está configurada (`writeAwaitServer`, bootstrap `/portal/sync`). PostgreSQL replica el modelo de colecciones con comentarios `KEYS.&lt;nombre&gt;` en los scripts SQL.</w:t>
-      </w:r>
-    </w:p>
-    <w:p>
-      <w:pPr>
-        <w:pStyle w:val="Heading2"/>
-      </w:pPr>
-      <w:r>
-        <w:t>2.2 Módulos de la API (NestJS)</w:t>
+        <w:t>Hoja de control documental</w:t>
       </w:r>
     </w:p>
     <w:tbl>
@@ -143,7 +151,7 @@
           </w:tcPr>
           <w:p>
             <w:r>
-              <w:t>Módulo</w:t>
+              <w:t>Campo de control documental</w:t>
             </w:r>
           </w:p>
         </w:tc>
@@ -153,7 +161,7 @@
           </w:tcPr>
           <w:p>
             <w:r>
-              <w:t>Propósito</w:t>
+              <w:t>Valor</w:t>
             </w:r>
           </w:p>
         </w:tc>
@@ -165,7 +173,7 @@
           </w:tcPr>
           <w:p>
             <w:r>
-              <w:t>ConfigModule / Throttler</w:t>
+              <w:t>Clasificación sugerida</w:t>
             </w:r>
           </w:p>
         </w:tc>
@@ -175,7 +183,7 @@
           </w:tcPr>
           <w:p>
             <w:r>
-              <w:t>Variables `.env`; límite 80 req/min por IP.</w:t>
+              <w:t>Confidencial — uso cliente y socios tecnológicos bajo acuerdos de confidencialidad aplicables</w:t>
             </w:r>
           </w:p>
         </w:tc>
@@ -187,7 +195,7 @@
           </w:tcPr>
           <w:p>
             <w:r>
-              <w:t>DatabaseModule + pg Pool</w:t>
+              <w:t>Versión del entregable</w:t>
             </w:r>
           </w:p>
         </w:tc>
@@ -197,7 +205,7 @@
           </w:tcPr>
           <w:p>
             <w:r>
-              <w:t>Conexión Postgres; zona horaria de sesión `America/Bogota` donde aplica.</w:t>
+              <w:t>2.1 — portada institucional + vistas gráficas (PNG 220 dpi) + PDF opcional (Word/LibreOffice)</w:t>
             </w:r>
           </w:p>
         </w:tc>
@@ -209,7 +217,7 @@
           </w:tcPr>
           <w:p>
             <w:r>
-              <w:t>AuthModule</w:t>
+              <w:t>Alcance técnico</w:t>
             </w:r>
           </w:p>
         </w:tc>
@@ -219,7 +227,7 @@
           </w:tcPr>
           <w:p>
             <w:r>
-              <w:t>JWT (access token), bcrypt, Passport, Turnstile, correo recuperación/aprobación.</w:t>
+              <w:t>Implementación repositorio “Antares Nuevo”</w:t>
             </w:r>
           </w:p>
         </w:tc>
@@ -231,7 +239,7 @@
           </w:tcPr>
           <w:p>
             <w:r>
-              <w:t>PortalModule</w:t>
+              <w:t>Identidad visual (portada)</w:t>
             </w:r>
           </w:p>
         </w:tc>
@@ -241,7 +249,7 @@
           </w:tcPr>
           <w:p>
             <w:r>
-              <w:t>Bootstrap, sincronización de entidades (empresas, usuarios, nómina, viajes…).</w:t>
+              <w:t>Logo embebido desde C:\Users\User\Documents\Antares Nuevo\imagenes empresa\Logo.png</w:t>
             </w:r>
           </w:p>
         </w:tc>
@@ -253,7 +261,7 @@
           </w:tcPr>
           <w:p>
             <w:r>
-              <w:t>PayrollModule</w:t>
+              <w:t>Reproductibilidad diagramas / Word</w:t>
             </w:r>
           </w:p>
         </w:tc>
@@ -263,84 +271,92 @@
           </w:tcPr>
           <w:p>
             <w:r>
-              <w:t>Liquidación/colombiano, autocorte por periodicidad Bogotá, `@nestjs/schedule`.</w:t>
-            </w:r>
-          </w:p>
-        </w:tc>
-      </w:tr>
-      <w:tr>
-        <w:tc>
-          <w:tcPr>
-            <w:tcW w:type="dxa" w:w="4320"/>
-          </w:tcPr>
-          <w:p>
-            <w:r>
-              <w:t>FilesModule / UploadsModule</w:t>
-            </w:r>
-          </w:p>
-        </w:tc>
-        <w:tc>
-          <w:tcPr>
-            <w:tcW w:type="dxa" w:w="4320"/>
-          </w:tcPr>
-          <w:p>
-            <w:r>
-              <w:t>Documentos firmados/presigned (ej. R2/S3 según configuración).</w:t>
-            </w:r>
-          </w:p>
-        </w:tc>
-      </w:tr>
-      <w:tr>
-        <w:tc>
-          <w:tcPr>
-            <w:tcW w:type="dxa" w:w="4320"/>
-          </w:tcPr>
-          <w:p>
-            <w:r>
-              <w:t>MailModule</w:t>
-            </w:r>
-          </w:p>
-        </w:tc>
-        <w:tc>
-          <w:tcPr>
-            <w:tcW w:type="dxa" w:w="4320"/>
-          </w:tcPr>
-          <w:p>
-            <w:r>
-              <w:t>Resend / alternativas.</w:t>
-            </w:r>
-          </w:p>
-        </w:tc>
-      </w:tr>
-      <w:tr>
-        <w:tc>
-          <w:tcPr>
-            <w:tcW w:type="dxa" w:w="4320"/>
-          </w:tcPr>
-          <w:p>
-            <w:r>
-              <w:t>B2bProspectModule</w:t>
-            </w:r>
-          </w:p>
-        </w:tc>
-        <w:tc>
-          <w:tcPr>
-            <w:tcW w:type="dxa" w:w="4320"/>
-          </w:tcPr>
-          <w:p>
-            <w:r>
-              <w:t>Prospectos formulario institucional.</w:t>
+              <w:t>C:\Users\User\Documents\Antares Nuevo\docs\generar_arquitectura_uiux.py</w:t>
             </w:r>
           </w:p>
         </w:tc>
       </w:tr>
     </w:tbl>
     <w:p>
+      <w:r>
+        <w:rPr>
+          <w:b w:val="0"/>
+        </w:rPr>
+        <w:t>El cuerpo del informe sintetiza arquitectura AS-IS observable en código fuente (`index.html` / `app.js` / `apps/api`). Las figuras se generaron con Matplotlib para permitir auditoría reproducible ante comités de revisión tecnológica.</w:t>
+      </w:r>
+    </w:p>
+    <w:p>
+      <w:r>
+        <w:br w:type="page"/>
+      </w:r>
+    </w:p>
+    <w:p>
+      <w:pPr>
+        <w:pStyle w:val="Heading1"/>
+      </w:pPr>
+      <w:r>
+        <w:t>Resumen ejecutivo</w:t>
+      </w:r>
+    </w:p>
+    <w:p>
+      <w:pPr>
+        <w:pStyle w:val="ListBullet"/>
+      </w:pPr>
+      <w:r>
+        <w:t>Plataforma monolítica en el lado cliente (`index.html` + `styles.css` + `app.js`) combinando marca pública B2B y portal empresarial con roles.</w:t>
+      </w:r>
+    </w:p>
+    <w:p>
+      <w:pPr>
+        <w:pStyle w:val="ListBullet"/>
+      </w:pPr>
+      <w:r>
+        <w:t>API REST modular NestJS 10 (`/api`) orquestando autenticación, hidratación/sync de estado y reglas específicas Colombia (liquidación período Bogotá).</w:t>
+      </w:r>
+    </w:p>
+    <w:p>
+      <w:pPr>
+        <w:pStyle w:val="ListBullet"/>
+      </w:pPr>
+      <w:r>
+        <w:t>Relacional PostgreSQL como fuente autoritativa; contrato físico DDL versionado bajo `BD/postgres/` con opción RLS y Supabase cuando se proyecta.</w:t>
+      </w:r>
+    </w:p>
+    <w:p>
+      <w:pPr>
+        <w:pStyle w:val="ListBullet"/>
+      </w:pPr>
+      <w:r>
+        <w:t>Capas de seguridad transversales: JWT, hashing bcrypt, CORS parametrizado, cabeceras de endurecimiento, rate limiting y zona horaria de sesión BD `America/Bogota`.</w:t>
+      </w:r>
+    </w:p>
+    <w:p>
+      <w:r>
+        <w:br w:type="page"/>
+      </w:r>
+    </w:p>
+    <w:p>
+      <w:pPr>
+        <w:pStyle w:val="Heading1"/>
+      </w:pPr>
+      <w:r>
+        <w:t>1. Propósito, audiencia y criterios de revisión</w:t>
+      </w:r>
+    </w:p>
+    <w:p>
+      <w:r>
+        <w:rPr>
+          <w:b w:val="0"/>
+        </w:rPr>
+        <w:t>Dirigido a perfiles enterprise (arquitectos de solución, líder técnico, CISO funcionales, auditors de integración SaaS): consolida vistas C4-lite, modelo de información y referencias DDL sin sustituir un ADR formales ni políticas corporativas del cliente.</w:t>
+      </w:r>
+    </w:p>
+    <w:p>
       <w:pPr>
         <w:pStyle w:val="Heading2"/>
       </w:pPr>
       <w:r>
-        <w:t>2.3 Seguridad y cabeceras</w:t>
+        <w:t>1.1 Actores y preocupaciones transversales</w:t>
       </w:r>
     </w:p>
     <w:tbl>
@@ -360,7 +376,7 @@
           </w:tcPr>
           <w:p>
             <w:r>
-              <w:t>Capa</w:t>
+              <w:t>Actor / stakehol.</w:t>
             </w:r>
           </w:p>
         </w:tc>
@@ -370,7 +386,7 @@
           </w:tcPr>
           <w:p>
             <w:r>
-              <w:t>Detalle</w:t>
+              <w:t>Interés arquitectónico</w:t>
             </w:r>
           </w:p>
         </w:tc>
@@ -382,7 +398,7 @@
           </w:tcPr>
           <w:p>
             <w:r>
-              <w:t>CORS</w:t>
+              <w:t>Negocio logístico</w:t>
             </w:r>
           </w:p>
         </w:tc>
@@ -392,7 +408,7 @@
           </w:tcPr>
           <w:p>
             <w:r>
-              <w:t>Lista explícita dev + dominios prod Antares (*.vercel, pages.dev opcional); credenciales.</w:t>
+              <w:t>Continuidad operativa, trazabilidad transporte, cumplimiento cadena de frío.</w:t>
             </w:r>
           </w:p>
         </w:tc>
@@ -404,7 +420,7 @@
           </w:tcPr>
           <w:p>
             <w:r>
-              <w:t>API</w:t>
+              <w:t>RRHH / Nómina</w:t>
             </w:r>
           </w:p>
         </w:tc>
@@ -414,7 +430,7 @@
           </w:tcPr>
           <w:p>
             <w:r>
-              <w:t>`X-Content-Type-Options: nosniff`, `X-Frame-Options: DENY`, Referrer-Policy.</w:t>
+              <w:t>Homologación periodicidad pago empleado ↔ motor liquidación; cumplimiento normativo CO.</w:t>
             </w:r>
           </w:p>
         </w:tc>
@@ -426,7 +442,7 @@
           </w:tcPr>
           <w:p>
             <w:r>
-              <w:t>Front</w:t>
+              <w:t>TI / Seguridad</w:t>
             </w:r>
           </w:p>
         </w:tc>
@@ -436,7 +452,7 @@
           </w:tcPr>
           <w:p>
             <w:r>
-              <w:t>CSP en meta (base-uri, frame-ancestors, form-action), Turnstile anti-bot en auth.</w:t>
+              <w:t>Minimizar superficie de ataque, secretos fuera del navegador, observabilidad.</w:t>
             </w:r>
           </w:p>
         </w:tc>
@@ -448,7 +464,7 @@
           </w:tcPr>
           <w:p>
             <w:r>
-              <w:t>Validación</w:t>
+              <w:t>Marketing / Marca</w:t>
             </w:r>
           </w:p>
         </w:tc>
@@ -458,27 +474,416 @@
           </w:tcPr>
           <w:p>
             <w:r>
-              <w:t>ValidationPipe global Nest (whitelist, forbidNonWhitelisted).</w:t>
+              <w:t>Consistencia visual tokens CSS, accesibilidad y rendimiento percepción.</w:t>
             </w:r>
           </w:p>
         </w:tc>
       </w:tr>
     </w:tbl>
     <w:p>
+      <w:r>
+        <w:br w:type="page"/>
+      </w:r>
+    </w:p>
+    <w:p>
       <w:pPr>
-        <w:pStyle w:val="Heading2"/>
+        <w:pStyle w:val="Heading1"/>
       </w:pPr>
       <w:r>
-        <w:t>2.4 Front secundario</w:t>
+        <w:t>2. Marcos de referencia (lectura arquitectónica)</w:t>
       </w:r>
     </w:p>
     <w:p>
       <w:r>
         <w:rPr>
           <w:b w:val="0"/>
-          <w:sz w:val="22"/>
         </w:rPr>
-        <w:t>Existe `apps/web` (Next.js + Tailwind) con variables de marca alineadas en `globals.css`. La experiencia principal documentada aquí corresponde al SPA raíz (`index.html` + `styles.css`).</w:t>
+        <w:t>Las siguientes figuras adoptan el espíritu de modelado en capas (ISO/IEC/IEEE 42010 + prácticas C4 / arc42) sin pretender certificación: sirven como punta de anclaje para walkthrough con un comité de arquitectura.</w:t>
+      </w:r>
+    </w:p>
+    <w:p>
+      <w:pPr>
+        <w:pStyle w:val="Heading2"/>
+      </w:pPr>
+      <w:r>
+        <w:t>2.1 Vista contextual (C4 Level 1 equivalente)</w:t>
+      </w:r>
+    </w:p>
+    <w:p>
+      <w:pPr>
+        <w:jc w:val="center"/>
+      </w:pPr>
+      <w:r>
+        <w:drawing>
+          <wp:inline xmlns:a="http://schemas.openxmlformats.org/drawingml/2006/main" xmlns:pic="http://schemas.openxmlformats.org/drawingml/2006/picture">
+            <wp:extent cx="5961888" cy="3454875"/>
+            <wp:docPr id="2" name="Picture 2"/>
+            <wp:cNvGraphicFramePr>
+              <a:graphicFrameLocks noChangeAspect="1"/>
+            </wp:cNvGraphicFramePr>
+            <a:graphic>
+              <a:graphicData uri="http://schemas.openxmlformats.org/drawingml/2006/picture">
+                <pic:pic>
+                  <pic:nvPicPr>
+                    <pic:cNvPr id="0" name="fig_a_contexto_sistema.png"/>
+                    <pic:cNvPicPr/>
+                  </pic:nvPicPr>
+                  <pic:blipFill>
+                    <a:blip r:embed="rId10"/>
+                    <a:stretch>
+                      <a:fillRect/>
+                    </a:stretch>
+                  </pic:blipFill>
+                  <pic:spPr>
+                    <a:xfrm>
+                      <a:off x="0" y="0"/>
+                      <a:ext cx="5961888" cy="3454875"/>
+                    </a:xfrm>
+                    <a:prstGeom prst="rect"/>
+                  </pic:spPr>
+                </pic:pic>
+              </a:graphicData>
+            </a:graphic>
+          </wp:inline>
+        </w:drawing>
+      </w:r>
+    </w:p>
+    <w:p>
+      <w:pPr>
+        <w:jc w:val="center"/>
+      </w:pPr>
+      <w:r>
+        <w:rPr>
+          <w:i/>
+          <w:sz w:val="18"/>
+        </w:rPr>
+        <w:t>Figura A — Actores humanos, sistema digital Antares y sistemas satélite (correo, CAPTCHA, base relacional, almacenamiento opcional).</w:t>
+      </w:r>
+    </w:p>
+    <w:p>
+      <w:r>
+        <w:rPr>
+          <w:b w:val="0"/>
+        </w:rPr>
+        <w:t>La frontera del sistema recoge explícitamente la dualidad sitio público + portal y el acoplamiento débil vía proveedores (SMTP, objeto S3-compat, Postgres administrado).</w:t>
+      </w:r>
+    </w:p>
+    <w:p>
+      <w:pPr>
+        <w:pStyle w:val="Heading2"/>
+      </w:pPr>
+      <w:r>
+        <w:t>2.2 Vista de contenedores (lógicos)</w:t>
+      </w:r>
+    </w:p>
+    <w:p>
+      <w:pPr>
+        <w:jc w:val="center"/>
+      </w:pPr>
+      <w:r>
+        <w:drawing>
+          <wp:inline xmlns:a="http://schemas.openxmlformats.org/drawingml/2006/main" xmlns:pic="http://schemas.openxmlformats.org/drawingml/2006/picture">
+            <wp:extent cx="5961888" cy="3855124"/>
+            <wp:docPr id="3" name="Picture 3"/>
+            <wp:cNvGraphicFramePr>
+              <a:graphicFrameLocks noChangeAspect="1"/>
+            </wp:cNvGraphicFramePr>
+            <a:graphic>
+              <a:graphicData uri="http://schemas.openxmlformats.org/drawingml/2006/picture">
+                <pic:pic>
+                  <pic:nvPicPr>
+                    <pic:cNvPr id="0" name="fig_b_contenedores.png"/>
+                    <pic:cNvPicPr/>
+                  </pic:nvPicPr>
+                  <pic:blipFill>
+                    <a:blip r:embed="rId11"/>
+                    <a:stretch>
+                      <a:fillRect/>
+                    </a:stretch>
+                  </pic:blipFill>
+                  <pic:spPr>
+                    <a:xfrm>
+                      <a:off x="0" y="0"/>
+                      <a:ext cx="5961888" cy="3855124"/>
+                    </a:xfrm>
+                    <a:prstGeom prst="rect"/>
+                  </pic:spPr>
+                </pic:pic>
+              </a:graphicData>
+            </a:graphic>
+          </wp:inline>
+        </w:drawing>
+      </w:r>
+    </w:p>
+    <w:p>
+      <w:pPr>
+        <w:jc w:val="center"/>
+      </w:pPr>
+      <w:r>
+        <w:rPr>
+          <w:i/>
+          <w:sz w:val="18"/>
+        </w:rPr>
+        <w:t>Figura B — Contenedor SPA, infraestructura estática CDN, runtime NestJS, persistencia y object storage opcional.</w:t>
+      </w:r>
+    </w:p>
+    <w:p>
+      <w:r>
+        <w:br w:type="page"/>
+      </w:r>
+    </w:p>
+    <w:p>
+      <w:pPr>
+        <w:pStyle w:val="Heading2"/>
+      </w:pPr>
+      <w:r>
+        <w:t>2.3 Vista de despliegue físico / ambiente típico nube</w:t>
+      </w:r>
+    </w:p>
+    <w:p>
+      <w:pPr>
+        <w:jc w:val="center"/>
+      </w:pPr>
+      <w:r>
+        <w:drawing>
+          <wp:inline xmlns:a="http://schemas.openxmlformats.org/drawingml/2006/main" xmlns:pic="http://schemas.openxmlformats.org/drawingml/2006/picture">
+            <wp:extent cx="5961888" cy="3224728"/>
+            <wp:docPr id="4" name="Picture 4"/>
+            <wp:cNvGraphicFramePr>
+              <a:graphicFrameLocks noChangeAspect="1"/>
+            </wp:cNvGraphicFramePr>
+            <a:graphic>
+              <a:graphicData uri="http://schemas.openxmlformats.org/drawingml/2006/picture">
+                <pic:pic>
+                  <pic:nvPicPr>
+                    <pic:cNvPr id="0" name="fig_c_despliegue_nube.png"/>
+                    <pic:cNvPicPr/>
+                  </pic:nvPicPr>
+                  <pic:blipFill>
+                    <a:blip r:embed="rId12"/>
+                    <a:stretch>
+                      <a:fillRect/>
+                    </a:stretch>
+                  </pic:blipFill>
+                  <pic:spPr>
+                    <a:xfrm>
+                      <a:off x="0" y="0"/>
+                      <a:ext cx="5961888" cy="3224728"/>
+                    </a:xfrm>
+                    <a:prstGeom prst="rect"/>
+                  </pic:spPr>
+                </pic:pic>
+              </a:graphicData>
+            </a:graphic>
+          </wp:inline>
+        </w:drawing>
+      </w:r>
+    </w:p>
+    <w:p>
+      <w:pPr>
+        <w:jc w:val="center"/>
+      </w:pPr>
+      <w:r>
+        <w:rPr>
+          <w:i/>
+          <w:sz w:val="18"/>
+        </w:rPr>
+        <w:t>Figura C — Separación perímetro público CDN/WAF versus runtime API segregado y cluster Postgres administrado.</w:t>
+      </w:r>
+    </w:p>
+    <w:p>
+      <w:r>
+        <w:rPr>
+          <w:b w:val="0"/>
+        </w:rPr>
+        <w:t>Este patrón es coherente con despliegues documentados auxiliares (`BD/docs/Manual_Despliegue_Supabase_Cloudflare.docx`): edge estático, API stateful detrás del perímetro aplicativo y Postgres como servicio administrado.</w:t>
+      </w:r>
+    </w:p>
+    <w:p>
+      <w:r>
+        <w:br w:type="page"/>
+      </w:r>
+    </w:p>
+    <w:p>
+      <w:pPr>
+        <w:pStyle w:val="Heading2"/>
+      </w:pPr>
+      <w:r>
+        <w:t>2.4 Vista de componentes — backend NestJS</w:t>
+      </w:r>
+    </w:p>
+    <w:p>
+      <w:pPr>
+        <w:jc w:val="center"/>
+      </w:pPr>
+      <w:r>
+        <w:drawing>
+          <wp:inline xmlns:a="http://schemas.openxmlformats.org/drawingml/2006/main" xmlns:pic="http://schemas.openxmlformats.org/drawingml/2006/picture">
+            <wp:extent cx="5961888" cy="3320759"/>
+            <wp:docPr id="5" name="Picture 5"/>
+            <wp:cNvGraphicFramePr>
+              <a:graphicFrameLocks noChangeAspect="1"/>
+            </wp:cNvGraphicFramePr>
+            <a:graphic>
+              <a:graphicData uri="http://schemas.openxmlformats.org/drawingml/2006/picture">
+                <pic:pic>
+                  <pic:nvPicPr>
+                    <pic:cNvPr id="0" name="fig_d_componentes_api.png"/>
+                    <pic:cNvPicPr/>
+                  </pic:nvPicPr>
+                  <pic:blipFill>
+                    <a:blip r:embed="rId13"/>
+                    <a:stretch>
+                      <a:fillRect/>
+                    </a:stretch>
+                  </pic:blipFill>
+                  <pic:spPr>
+                    <a:xfrm>
+                      <a:off x="0" y="0"/>
+                      <a:ext cx="5961888" cy="3320759"/>
+                    </a:xfrm>
+                    <a:prstGeom prst="rect"/>
+                  </pic:spPr>
+                </pic:pic>
+              </a:graphicData>
+            </a:graphic>
+          </wp:inline>
+        </w:drawing>
+      </w:r>
+    </w:p>
+    <w:p>
+      <w:pPr>
+        <w:jc w:val="center"/>
+      </w:pPr>
+      <w:r>
+        <w:rPr>
+          <w:i/>
+          <w:sz w:val="18"/>
+        </w:rPr>
+        <w:t>Figura D — Descomposición AppModule NestJS incluyendo módulos de dominio y cross-cutting infraestructura.</w:t>
+      </w:r>
+    </w:p>
+    <w:p>
+      <w:pPr>
+        <w:pStyle w:val="Heading2"/>
+      </w:pPr>
+      <w:r>
+        <w:t>2.5 Contextos dominio / modelo de información persistido</w:t>
+      </w:r>
+    </w:p>
+    <w:p>
+      <w:pPr>
+        <w:jc w:val="center"/>
+      </w:pPr>
+      <w:r>
+        <w:drawing>
+          <wp:inline xmlns:a="http://schemas.openxmlformats.org/drawingml/2006/main" xmlns:pic="http://schemas.openxmlformats.org/drawingml/2006/picture">
+            <wp:extent cx="5961888" cy="3082833"/>
+            <wp:docPr id="6" name="Picture 6"/>
+            <wp:cNvGraphicFramePr>
+              <a:graphicFrameLocks noChangeAspect="1"/>
+            </wp:cNvGraphicFramePr>
+            <a:graphic>
+              <a:graphicData uri="http://schemas.openxmlformats.org/drawingml/2006/picture">
+                <pic:pic>
+                  <pic:nvPicPr>
+                    <pic:cNvPr id="0" name="fig_e_contextos_datos.png"/>
+                    <pic:cNvPicPr/>
+                  </pic:nvPicPr>
+                  <pic:blipFill>
+                    <a:blip r:embed="rId14"/>
+                    <a:stretch>
+                      <a:fillRect/>
+                    </a:stretch>
+                  </pic:blipFill>
+                  <pic:spPr>
+                    <a:xfrm>
+                      <a:off x="0" y="0"/>
+                      <a:ext cx="5961888" cy="3082833"/>
+                    </a:xfrm>
+                    <a:prstGeom prst="rect"/>
+                  </pic:spPr>
+                </pic:pic>
+              </a:graphicData>
+            </a:graphic>
+          </wp:inline>
+        </w:drawing>
+      </w:r>
+    </w:p>
+    <w:p>
+      <w:pPr>
+        <w:jc w:val="center"/>
+      </w:pPr>
+      <w:r>
+        <w:rPr>
+          <w:i/>
+          <w:sz w:val="18"/>
+        </w:rPr>
+        <w:t>Figura E — Bounded contexts agrupados según DDL (03–06_*). FKs garantizan coherencia inter-contexto.</w:t>
+      </w:r>
+    </w:p>
+    <w:p>
+      <w:r>
+        <w:br w:type="page"/>
+      </w:r>
+    </w:p>
+    <w:p>
+      <w:pPr>
+        <w:pStyle w:val="Heading2"/>
+      </w:pPr>
+      <w:r>
+        <w:t>2.6 Capas seguridad — defensa en profundidad</w:t>
+      </w:r>
+    </w:p>
+    <w:p>
+      <w:pPr>
+        <w:jc w:val="center"/>
+      </w:pPr>
+      <w:r>
+        <w:drawing>
+          <wp:inline xmlns:a="http://schemas.openxmlformats.org/drawingml/2006/main" xmlns:pic="http://schemas.openxmlformats.org/drawingml/2006/picture">
+            <wp:extent cx="5961888" cy="3015321"/>
+            <wp:docPr id="7" name="Picture 7"/>
+            <wp:cNvGraphicFramePr>
+              <a:graphicFrameLocks noChangeAspect="1"/>
+            </wp:cNvGraphicFramePr>
+            <a:graphic>
+              <a:graphicData uri="http://schemas.openxmlformats.org/drawingml/2006/picture">
+                <pic:pic>
+                  <pic:nvPicPr>
+                    <pic:cNvPr id="0" name="fig_f_capas_seguridad.png"/>
+                    <pic:cNvPicPr/>
+                  </pic:nvPicPr>
+                  <pic:blipFill>
+                    <a:blip r:embed="rId15"/>
+                    <a:stretch>
+                      <a:fillRect/>
+                    </a:stretch>
+                  </pic:blipFill>
+                  <pic:spPr>
+                    <a:xfrm>
+                      <a:off x="0" y="0"/>
+                      <a:ext cx="5961888" cy="3015321"/>
+                    </a:xfrm>
+                    <a:prstGeom prst="rect"/>
+                  </pic:spPr>
+                </pic:pic>
+              </a:graphicData>
+            </a:graphic>
+          </wp:inline>
+        </w:drawing>
+      </w:r>
+    </w:p>
+    <w:p>
+      <w:pPr>
+        <w:jc w:val="center"/>
+      </w:pPr>
+      <w:r>
+        <w:rPr>
+          <w:i/>
+          <w:sz w:val="18"/>
+        </w:rPr>
+        <w:t>Figura F — Controles distribuidos de borde hasta integridad datos en BD.</w:t>
       </w:r>
     </w:p>
     <w:p>
@@ -491,24 +896,7 @@
         <w:pStyle w:val="Heading1"/>
       </w:pPr>
       <w:r>
-        <w:t>3. Sistema de diseño UI</w:t>
-      </w:r>
-    </w:p>
-    <w:p>
-      <w:r>
-        <w:rPr>
-          <w:b w:val="0"/>
-          <w:sz w:val="22"/>
-        </w:rPr>
-        <w:t>Las variables CSS en `:root` y `body[data-theme="dark"]` definen el sistema visual: paleta corporativa azul Antares, elevación de tarjetas, radios y tipografía institucional. No hay librería de componentes tipo Material; los patrones son clases CSS reutilizables (`.btn`, `.card`, `.glass-card`, secciones hero/section-soft).</w:t>
-      </w:r>
-    </w:p>
-    <w:p>
-      <w:pPr>
-        <w:pStyle w:val="Heading2"/>
-      </w:pPr>
-      <w:r>
-        <w:t>3.1 Tokens de color (modo claro — referencia `:root`)</w:t>
+        <w:t>3. Atributos de calidad observables en código AS-IS</w:t>
       </w:r>
     </w:p>
     <w:tbl>
@@ -528,7 +916,7 @@
           </w:tcPr>
           <w:p>
             <w:r>
-              <w:t>Token CSS</w:t>
+              <w:t>Atributo ISO 25010 (referencia)</w:t>
             </w:r>
           </w:p>
         </w:tc>
@@ -538,7 +926,7 @@
           </w:tcPr>
           <w:p>
             <w:r>
-              <w:t>Hex / uso</w:t>
+              <w:t>Evidencias en repos</w:t>
             </w:r>
           </w:p>
         </w:tc>
@@ -550,7 +938,7 @@
           </w:tcPr>
           <w:p>
             <w:r>
-              <w:t>--brand-blue-deep / --primary</w:t>
+              <w:t>Seguridad</w:t>
             </w:r>
           </w:p>
         </w:tc>
@@ -560,7 +948,7 @@
           </w:tcPr>
           <w:p>
             <w:r>
-              <w:t>#377CC0 · acento marca, enlaces fuertes, theme-color meta</w:t>
+              <w:t>JWT, bcrypt; Turnstile; CSP; DENY iframe; TZ sesión Postgres Bogotá; Throttler 80 rpm.</w:t>
             </w:r>
           </w:p>
         </w:tc>
@@ -572,7 +960,7 @@
           </w:tcPr>
           <w:p>
             <w:r>
-              <w:t>--brand-blue-mid / --accent</w:t>
+              <w:t>Compatibilidad / i18n</w:t>
             </w:r>
           </w:p>
         </w:tc>
@@ -582,7 +970,7 @@
           </w:tcPr>
           <w:p>
             <w:r>
-              <w:t>#83BEE9 · acentos suaves</w:t>
+              <w:t>Toggle ES/en; formato fechas/monetary adaptación regional.</w:t>
             </w:r>
           </w:p>
         </w:tc>
@@ -594,7 +982,7 @@
           </w:tcPr>
           <w:p>
             <w:r>
-              <w:t>--brand-blue-soft</w:t>
+              <w:t>Mantenibilidad modular API</w:t>
             </w:r>
           </w:p>
         </w:tc>
@@ -604,7 +992,7 @@
           </w:tcPr>
           <w:p>
             <w:r>
-              <w:t>#CCE5F8 · fondos de módulos</w:t>
+              <w:t>Inyección Nest, módulos separados Payroll/Portal/Mail...</w:t>
             </w:r>
           </w:p>
         </w:tc>
@@ -616,7 +1004,7 @@
           </w:tcPr>
           <w:p>
             <w:r>
-              <w:t>--primary-dark / --primary-deeper</w:t>
+              <w:t>Portabilidad</w:t>
             </w:r>
           </w:p>
         </w:tc>
@@ -626,145 +1014,31 @@
           </w:tcPr>
           <w:p>
             <w:r>
-              <w:t>#2A6399 · #1E4A73 · profundidad en gradientes</w:t>
-            </w:r>
-          </w:p>
-        </w:tc>
-      </w:tr>
-      <w:tr>
-        <w:tc>
-          <w:tcPr>
-            <w:tcW w:type="dxa" w:w="4320"/>
-          </w:tcPr>
-          <w:p>
-            <w:r>
-              <w:t>--text / --text-soft</w:t>
-            </w:r>
-          </w:p>
-        </w:tc>
-        <w:tc>
-          <w:tcPr>
-            <w:tcW w:type="dxa" w:w="4320"/>
-          </w:tcPr>
-          <w:p>
-            <w:r>
-              <w:t>#0B2138 · #3A5A78</w:t>
-            </w:r>
-          </w:p>
-        </w:tc>
-      </w:tr>
-      <w:tr>
-        <w:tc>
-          <w:tcPr>
-            <w:tcW w:type="dxa" w:w="4320"/>
-          </w:tcPr>
-          <w:p>
-            <w:r>
-              <w:t>--line</w:t>
-            </w:r>
-          </w:p>
-        </w:tc>
-        <w:tc>
-          <w:tcPr>
-            <w:tcW w:type="dxa" w:w="4320"/>
-          </w:tcPr>
-          <w:p>
-            <w:r>
-              <w:t>#B8D4EB · bordes</w:t>
-            </w:r>
-          </w:p>
-        </w:tc>
-      </w:tr>
-      <w:tr>
-        <w:tc>
-          <w:tcPr>
-            <w:tcW w:type="dxa" w:w="4320"/>
-          </w:tcPr>
-          <w:p>
-            <w:r>
-              <w:t>--success / --warning / --danger</w:t>
-            </w:r>
-          </w:p>
-        </w:tc>
-        <w:tc>
-          <w:tcPr>
-            <w:tcW w:type="dxa" w:w="4320"/>
-          </w:tcPr>
-          <w:p>
-            <w:r>
-              <w:t>#1B8E5F · #F59F00 · #D62828</w:t>
-            </w:r>
-          </w:p>
-        </w:tc>
-      </w:tr>
-      <w:tr>
-        <w:tc>
-          <w:tcPr>
-            <w:tcW w:type="dxa" w:w="4320"/>
-          </w:tcPr>
-          <w:p>
-            <w:r>
-              <w:t>Hero gradient</w:t>
-            </w:r>
-          </w:p>
-        </w:tc>
-        <w:tc>
-          <w:tcPr>
-            <w:tcW w:type="dxa" w:w="4320"/>
-          </w:tcPr>
-          <w:p>
-            <w:r>
-              <w:t>linear 135deg: #1E4A73 → #377CC0 → #83BEE9</w:t>
-            </w:r>
-          </w:p>
-        </w:tc>
-      </w:tr>
-      <w:tr>
-        <w:tc>
-          <w:tcPr>
-            <w:tcW w:type="dxa" w:w="4320"/>
-          </w:tcPr>
-          <w:p>
-            <w:r>
-              <w:t>Sombras tarjeta/botón</w:t>
-            </w:r>
-          </w:p>
-        </w:tc>
-        <w:tc>
-          <w:tcPr>
-            <w:tcW w:type="dxa" w:w="4320"/>
-          </w:tcPr>
-          <w:p>
-            <w:r>
-              <w:t>rgba(primary-rgb) con radios 16px / 10px</w:t>
+              <w:t>Node PostgreSQL estándares; DDL scriptable migrations.</w:t>
             </w:r>
           </w:p>
         </w:tc>
       </w:tr>
     </w:tbl>
     <w:p>
+      <w:r>
+        <w:br w:type="page"/>
+      </w:r>
+    </w:p>
+    <w:p>
       <w:pPr>
-        <w:pStyle w:val="Heading2"/>
+        <w:pStyle w:val="Heading1"/>
       </w:pPr>
       <w:r>
-        <w:t>3.2 Modo oscuro</w:t>
+        <w:t>4. Sistema de diseño UI/UX institucional</w:t>
       </w:r>
     </w:p>
     <w:p>
       <w:r>
         <w:rPr>
           <w:b w:val="0"/>
-          <w:sz w:val="22"/>
         </w:rPr>
-        <w:t>Al activar `data-theme="dark"` en `body`, se invierten fondos (base #071824), texto claro, nav translúcida oscura, y sombras más profundas. La preferencia persiste en `localStorage` (`antares_theme_v1`). El arranque del portal oculta el sitio público brevemente si hay sesión válida para evitar parpadeo de tema.</w:t>
-      </w:r>
-    </w:p>
-    <w:p>
-      <w:pPr>
-        <w:pStyle w:val="Heading2"/>
-      </w:pPr>
-      <w:r>
-        <w:t>3.3 Tipografía</w:t>
+        <w:t>`styles.css` materializa paleta marca #377CC0 derivados claros/obscuros (`:root`) y modo oscuro vía `data-theme`.</w:t>
       </w:r>
     </w:p>
     <w:tbl>
@@ -784,7 +1058,7 @@
           </w:tcPr>
           <w:p>
             <w:r>
-              <w:t>Rol</w:t>
+              <w:t>Rol tipográfico</w:t>
             </w:r>
           </w:p>
         </w:tc>
@@ -794,7 +1068,7 @@
           </w:tcPr>
           <w:p>
             <w:r>
-              <w:t>Familia (Google Fonts)</w:t>
+              <w:t>Implementación</w:t>
             </w:r>
           </w:p>
         </w:tc>
@@ -806,7 +1080,7 @@
           </w:tcPr>
           <w:p>
             <w:r>
-              <w:t>Display / títulos</w:t>
+              <w:t>Títulos</w:t>
             </w:r>
           </w:p>
         </w:tc>
@@ -816,7 +1090,7 @@
           </w:tcPr>
           <w:p>
             <w:r>
-              <w:t>Montserrat 600 — variable `--font-display`</w:t>
+              <w:t>Montserrat 600 (--font-display)</w:t>
             </w:r>
           </w:p>
         </w:tc>
@@ -828,7 +1102,7 @@
           </w:tcPr>
           <w:p>
             <w:r>
-              <w:t>Énfasis / CTA secundarios</w:t>
+              <w:t>CTA destacados</w:t>
             </w:r>
           </w:p>
         </w:tc>
@@ -838,7 +1112,7 @@
           </w:tcPr>
           <w:p>
             <w:r>
-              <w:t>Poppins 600–700 — `--font-secondary`</w:t>
+              <w:t>Poppins (--font-secondary)</w:t>
             </w:r>
           </w:p>
         </w:tc>
@@ -850,7 +1124,7 @@
           </w:tcPr>
           <w:p>
             <w:r>
-              <w:t>Cuerpo / formularios</w:t>
+              <w:t>Cuerpo/UI</w:t>
             </w:r>
           </w:p>
         </w:tc>
@@ -860,211 +1134,7 @@
           </w:tcPr>
           <w:p>
             <w:r>
-              <w:t>Roboto 400–500 — `--font-body`</w:t>
-            </w:r>
-          </w:p>
-        </w:tc>
-      </w:tr>
-    </w:tbl>
-    <w:p>
-      <w:r>
-        <w:rPr>
-          <w:b w:val="0"/>
-          <w:sz w:val="22"/>
-        </w:rPr>
-        <w:t>Contenedor principal: `width: min(1180px, 92%)`; barra superior usa hasta 1360px.</w:t>
-      </w:r>
-    </w:p>
-    <w:p>
-      <w:pPr>
-        <w:pStyle w:val="Heading2"/>
-      </w:pPr>
-      <w:r>
-        <w:t>3.4 Componentes y patrones de interfaz</w:t>
-      </w:r>
-    </w:p>
-    <w:tbl>
-      <w:tblPr>
-        <w:tblStyle w:val="TableGrid"/>
-        <w:tblW w:type="auto" w:w="0"/>
-        <w:tblLook w:firstColumn="1" w:firstRow="1" w:lastColumn="0" w:lastRow="0" w:noHBand="0" w:noVBand="1" w:val="04A0"/>
-      </w:tblPr>
-      <w:tblGrid>
-        <w:gridCol w:w="4320"/>
-        <w:gridCol w:w="4320"/>
-      </w:tblGrid>
-      <w:tr>
-        <w:tc>
-          <w:tcPr>
-            <w:tcW w:type="dxa" w:w="4320"/>
-          </w:tcPr>
-          <w:p>
-            <w:r>
-              <w:t>Patrón</w:t>
-            </w:r>
-          </w:p>
-        </w:tc>
-        <w:tc>
-          <w:tcPr>
-            <w:tcW w:type="dxa" w:w="4320"/>
-          </w:tcPr>
-          <w:p>
-            <w:r>
-              <w:t>Comportamiento</w:t>
-            </w:r>
-          </w:p>
-        </w:tc>
-      </w:tr>
-      <w:tr>
-        <w:tc>
-          <w:tcPr>
-            <w:tcW w:type="dxa" w:w="4320"/>
-          </w:tcPr>
-          <w:p>
-            <w:r>
-              <w:t>Barra superior pública</w:t>
-            </w:r>
-          </w:p>
-        </w:tc>
-        <w:tc>
-          <w:tcPr>
-            <w:tcW w:type="dxa" w:w="4320"/>
-          </w:tcPr>
-          <w:p>
-            <w:r>
-              <w:t>Sticky, blur, logo PNG, anclas a secciones, hamburguesa móvil, tema, idioma CO/US, CTA Portal</w:t>
-            </w:r>
-          </w:p>
-        </w:tc>
-      </w:tr>
-      <w:tr>
-        <w:tc>
-          <w:tcPr>
-            <w:tcW w:type="dxa" w:w="4320"/>
-          </w:tcPr>
-          <w:p>
-            <w:r>
-              <w:t>Hero</w:t>
-            </w:r>
-          </w:p>
-        </w:tc>
-        <w:tc>
-          <w:tcPr>
-            <w:tcW w:type="dxa" w:w="4320"/>
-          </w:tcPr>
-          <w:p>
-            <w:r>
-              <w:t>Imagen de fondo, overlay, siluetas animadas, logo en panel glass, stats en glass-card, botones primary/ghost</w:t>
-            </w:r>
-          </w:p>
-        </w:tc>
-      </w:tr>
-      <w:tr>
-        <w:tc>
-          <w:tcPr>
-            <w:tcW w:type="dxa" w:w="4320"/>
-          </w:tcPr>
-          <w:p>
-            <w:r>
-              <w:t>Secciones</w:t>
-            </w:r>
-          </w:p>
-        </w:tc>
-        <w:tc>
-          <w:tcPr>
-            <w:tcW w:type="dxa" w:w="4320"/>
-          </w:tcPr>
-          <w:p>
-            <w:r>
-              <w:t>Ondas SVG entre bloques, grids 2–3 columnas, cards con icono SVG stroke 2px</w:t>
-            </w:r>
-          </w:p>
-        </w:tc>
-      </w:tr>
-      <w:tr>
-        <w:tc>
-          <w:tcPr>
-            <w:tcW w:type="dxa" w:w="4320"/>
-          </w:tcPr>
-          <w:p>
-            <w:r>
-              <w:t>Botones</w:t>
-            </w:r>
-          </w:p>
-        </w:tc>
-        <w:tc>
-          <w:tcPr>
-            <w:tcW w:type="dxa" w:w="4320"/>
-          </w:tcPr>
-          <w:p>
-            <w:r>
-              <w:t>`.btn-primary` con sombra de marca; `.btn-ghost-light` sobre hero oscuro</w:t>
-            </w:r>
-          </w:p>
-        </w:tc>
-      </w:tr>
-      <w:tr>
-        <w:tc>
-          <w:tcPr>
-            <w:tcW w:type="dxa" w:w="4320"/>
-          </w:tcPr>
-          <w:p>
-            <w:r>
-              <w:t>Portal</w:t>
-            </w:r>
-          </w:p>
-        </w:tc>
-        <w:tc>
-          <w:tcPr>
-            <w:tcW w:type="dxa" w:w="4320"/>
-          </w:tcPr>
-          <w:p>
-            <w:r>
-              <w:t>Contenedor `#portal-app` reemplaza vista pública; backdrop de navegación móvil</w:t>
-            </w:r>
-          </w:p>
-        </w:tc>
-      </w:tr>
-      <w:tr>
-        <w:tc>
-          <w:tcPr>
-            <w:tcW w:type="dxa" w:w="4320"/>
-          </w:tcPr>
-          <w:p>
-            <w:r>
-              <w:t>Notificaciones</w:t>
-            </w:r>
-          </w:p>
-        </w:tc>
-        <w:tc>
-          <w:tcPr>
-            <w:tcW w:type="dxa" w:w="4320"/>
-          </w:tcPr>
-          <w:p>
-            <w:r>
-              <w:t>Toasts/aviso coherentes con colores semánticos</w:t>
-            </w:r>
-          </w:p>
-        </w:tc>
-      </w:tr>
-      <w:tr>
-        <w:tc>
-          <w:tcPr>
-            <w:tcW w:type="dxa" w:w="4320"/>
-          </w:tcPr>
-          <w:p>
-            <w:r>
-              <w:t>Formularios RRHH/Nómina</w:t>
-            </w:r>
-          </w:p>
-        </w:tc>
-        <w:tc>
-          <w:tcPr>
-            <w:tcW w:type="dxa" w:w="4320"/>
-          </w:tcPr>
-          <w:p>
-            <w:r>
-              <w:t>Catálogo `CO_CATALOGS` (selects coherentes país Colombia): periodicidad, EPS, contrato, etc.</w:t>
+              <w:t>Roboto (--font-body)</w:t>
             </w:r>
           </w:p>
         </w:tc>
@@ -1075,130 +1145,68 @@
         <w:pStyle w:val="Heading2"/>
       </w:pPr>
       <w:r>
-        <w:t>3.5 Accesibilidad y UX aplicada</w:t>
+        <w:t>4.1 Arquitectura de información — página pública</w:t>
       </w:r>
     </w:p>
-    <w:tbl>
-      <w:tblPr>
-        <w:tblStyle w:val="TableGrid"/>
-        <w:tblW w:type="auto" w:w="0"/>
-        <w:tblLook w:firstColumn="1" w:firstRow="1" w:lastColumn="0" w:lastRow="0" w:noHBand="0" w:noVBand="1" w:val="04A0"/>
-      </w:tblPr>
-      <w:tblGrid>
-        <w:gridCol w:w="4320"/>
-        <w:gridCol w:w="4320"/>
-      </w:tblGrid>
-      <w:tr>
-        <w:tc>
-          <w:tcPr>
-            <w:tcW w:type="dxa" w:w="4320"/>
-          </w:tcPr>
-          <w:p>
-            <w:r>
-              <w:t>Tema</w:t>
-            </w:r>
-          </w:p>
-        </w:tc>
-        <w:tc>
-          <w:tcPr>
-            <w:tcW w:type="dxa" w:w="4320"/>
-          </w:tcPr>
-          <w:p>
-            <w:r>
-              <w:t>Implementación observable</w:t>
-            </w:r>
-          </w:p>
-        </w:tc>
-      </w:tr>
-      <w:tr>
-        <w:tc>
-          <w:tcPr>
-            <w:tcW w:type="dxa" w:w="4320"/>
-          </w:tcPr>
-          <w:p>
-            <w:r>
-              <w:t>Aria</w:t>
-            </w:r>
-          </w:p>
-        </w:tc>
-        <w:tc>
-          <w:tcPr>
-            <w:tcW w:type="dxa" w:w="4320"/>
-          </w:tcPr>
-          <w:p>
-            <w:r>
-              <w:t>Etiquetas en nav, aria-expanded en menú hamburguesa, tema e idioma con role group</w:t>
-            </w:r>
-          </w:p>
-        </w:tc>
-      </w:tr>
-      <w:tr>
-        <w:tc>
-          <w:tcPr>
-            <w:tcW w:type="dxa" w:w="4320"/>
-          </w:tcPr>
-          <w:p>
-            <w:r>
-              <w:t>Contraste</w:t>
-            </w:r>
-          </w:p>
-        </w:tc>
-        <w:tc>
-          <w:tcPr>
-            <w:tcW w:type="dxa" w:w="4320"/>
-          </w:tcPr>
-          <w:p>
-            <w:r>
-              <w:t>Texto oscuro sobre fondos claros; en oscuro texto #E8F4FC sobre base profunda</w:t>
-            </w:r>
-          </w:p>
-        </w:tc>
-      </w:tr>
-      <w:tr>
-        <w:tc>
-          <w:tcPr>
-            <w:tcW w:type="dxa" w:w="4320"/>
-          </w:tcPr>
-          <w:p>
-            <w:r>
-              <w:t>Motion</w:t>
-            </w:r>
-          </w:p>
-        </w:tc>
-        <w:tc>
-          <w:tcPr>
-            <w:tcW w:type="dxa" w:w="4320"/>
-          </w:tcPr>
-          <w:p>
-            <w:r>
-              <w:t>`scroll-behavior: smooth`; animaciones hero no bloqueantes con `prefers-*` donde aplica</w:t>
-            </w:r>
-          </w:p>
-        </w:tc>
-      </w:tr>
-      <w:tr>
-        <w:tc>
-          <w:tcPr>
-            <w:tcW w:type="dxa" w:w="4320"/>
-          </w:tcPr>
-          <w:p>
-            <w:r>
-              <w:t>Sesión portal</w:t>
-            </w:r>
-          </w:p>
-        </w:tc>
-        <w:tc>
-          <w:tcPr>
-            <w:tcW w:type="dxa" w:w="4320"/>
-          </w:tcPr>
-          <w:p>
-            <w:r>
-              <w:t>`antares_session_v2` + `lastActivityAt`; boot guard contra flash UI</w:t>
-            </w:r>
-          </w:p>
-        </w:tc>
-      </w:tr>
-    </w:tbl>
+    <w:p>
+      <w:pPr>
+        <w:jc w:val="center"/>
+      </w:pPr>
+      <w:r>
+        <w:drawing>
+          <wp:inline xmlns:a="http://schemas.openxmlformats.org/drawingml/2006/main" xmlns:pic="http://schemas.openxmlformats.org/drawingml/2006/picture">
+            <wp:extent cx="6327648" cy="1600489"/>
+            <wp:docPr id="8" name="Picture 8"/>
+            <wp:cNvGraphicFramePr>
+              <a:graphicFrameLocks noChangeAspect="1"/>
+            </wp:cNvGraphicFramePr>
+            <a:graphic>
+              <a:graphicData uri="http://schemas.openxmlformats.org/drawingml/2006/picture">
+                <pic:pic>
+                  <pic:nvPicPr>
+                    <pic:cNvPr id="0" name="fig_g_ia_sitio_publico.png"/>
+                    <pic:cNvPicPr/>
+                  </pic:nvPicPr>
+                  <pic:blipFill>
+                    <a:blip r:embed="rId16"/>
+                    <a:stretch>
+                      <a:fillRect/>
+                    </a:stretch>
+                  </pic:blipFill>
+                  <pic:spPr>
+                    <a:xfrm>
+                      <a:off x="0" y="0"/>
+                      <a:ext cx="6327648" cy="1600489"/>
+                    </a:xfrm>
+                    <a:prstGeom prst="rect"/>
+                  </pic:spPr>
+                </pic:pic>
+              </a:graphicData>
+            </a:graphic>
+          </wp:inline>
+        </w:drawing>
+      </w:r>
+    </w:p>
+    <w:p>
+      <w:pPr>
+        <w:jc w:val="center"/>
+      </w:pPr>
+      <w:r>
+        <w:rPr>
+          <w:i/>
+          <w:sz w:val="18"/>
+        </w:rPr>
+        <w:t>Figura G — Secuencia de anclas sitio marca (orden scroll coherente con menú navegación). Anchors `services` antes `fleet`.</w:t>
+      </w:r>
+    </w:p>
+    <w:p>
+      <w:r>
+        <w:rPr>
+          <w:b w:val="0"/>
+        </w:rPr>
+        <w:t>Los patrones táctico UI (hero gradient, glass-cards, navegación sticky blur, portal overlay con backdrop móvil) se implementan mediante clases reutilizables — no mediante kit de UI comercial cerrado.</w:t>
+      </w:r>
+    </w:p>
     <w:p>
       <w:r>
         <w:br w:type="page"/>
@@ -1209,53 +1217,7 @@
         <w:pStyle w:val="Heading1"/>
       </w:pPr>
       <w:r>
-        <w:t>4. Mapa UX del sitio público (referencia `index.html`)</w:t>
-      </w:r>
-    </w:p>
-    <w:p>
-      <w:r>
-        <w:rPr>
-          <w:rFonts w:ascii="Consolas" w:hAnsi="Consolas"/>
-          <w:sz w:val="18"/>
-        </w:rPr>
-        <w:t>[#hero]            Marca · propuesta valor · KPIs · CTA contacto / login</w:t>
-        <w:br/>
-        <w:t>[#about]           Quiénes somos · valores · estándar</w:t>
-        <w:br/>
-        <w:t>[#trusted]         Carrusel/logo pills aliados</w:t>
-        <w:br/>
-        <w:t>[#testimonials]    Experiencias</w:t>
-        <w:br/>
-        <w:t>[#services]        Servicios</w:t>
-        <w:br/>
-        <w:t>[#fleet]           Flota</w:t>
-        <w:br/>
-        <w:t>[#process]         Proceso operativo</w:t>
-        <w:br/>
-        <w:t>[#coverage]        Cobertura</w:t>
-        <w:br/>
-        <w:t>[#news]            Actualidad</w:t>
-        <w:br/>
-        <w:t>[#careers]         Carreras · formulario/contacto RH</w:t>
-        <w:br/>
-        <w:t>[#contact]         Formulario institucional B2B</w:t>
-      </w:r>
-    </w:p>
-    <w:p>
-      <w:pPr>
-        <w:pStyle w:val="Heading1"/>
-      </w:pPr>
-      <w:r>
-        <w:t>5. Mapa UX del portal (SPA `app.js`)</w:t>
-      </w:r>
-    </w:p>
-    <w:p>
-      <w:r>
-        <w:rPr>
-          <w:b w:val="0"/>
-          <w:sz w:val="22"/>
-        </w:rPr>
-        <w:t>Las vistas renderizadas dependen del rol (`ROLES`): administración usa módulos ampliados; cliente ve solicitudes y dashboards acotados. Los datos siguen colecciones lógicas mapeadas a tablas Postgres al sincronizar.</w:t>
+        <w:t>5. Sincronización datos portal ↔ servidor</w:t>
       </w:r>
     </w:p>
     <w:tbl>
@@ -1285,7 +1247,7 @@
           </w:tcPr>
           <w:p>
             <w:r>
-              <w:t>Tabla Postgres principal</w:t>
+              <w:t>Persistencia física Postgres</w:t>
             </w:r>
           </w:p>
         </w:tc>
@@ -1297,7 +1259,7 @@
           </w:tcPr>
           <w:p>
             <w:r>
-              <w:t>users → usuarios</w:t>
+              <w:t>users</w:t>
             </w:r>
           </w:p>
         </w:tc>
@@ -1307,7 +1269,7 @@
           </w:tcPr>
           <w:p>
             <w:r>
-              <w:t>Perfil portal, estado cuenta, empresa</w:t>
+              <w:t>usuarios</w:t>
             </w:r>
           </w:p>
         </w:tc>
@@ -1319,7 +1281,7 @@
           </w:tcPr>
           <w:p>
             <w:r>
-              <w:t>companies → empresas</w:t>
+              <w:t>companies</w:t>
             </w:r>
           </w:p>
         </w:tc>
@@ -1329,7 +1291,7 @@
           </w:tcPr>
           <w:p>
             <w:r>
-              <w:t>NIT, tipo relación, activo</w:t>
+              <w:t>empresas</w:t>
             </w:r>
           </w:p>
         </w:tc>
@@ -1341,7 +1303,7 @@
           </w:tcPr>
           <w:p>
             <w:r>
-              <w:t>requests → solicitudes_transporte</w:t>
+              <w:t>requests</w:t>
             </w:r>
           </w:p>
         </w:tc>
@@ -1351,7 +1313,7 @@
           </w:tcPr>
           <w:p>
             <w:r>
-              <w:t>Flujo cliente-operatorio</w:t>
+              <w:t>solicitudes_transporte</w:t>
             </w:r>
           </w:p>
         </w:tc>
@@ -1363,7 +1325,7 @@
           </w:tcPr>
           <w:p>
             <w:r>
-              <w:t>vehicles / drivers → vehiculos / conductores</w:t>
+              <w:t>vehicles / drivers</w:t>
             </w:r>
           </w:p>
         </w:tc>
@@ -1373,7 +1335,7 @@
           </w:tcPr>
           <w:p>
             <w:r>
-              <w:t>Capacidad, licencias, ocupación sistema</w:t>
+              <w:t>vehiculos / conductores</w:t>
             </w:r>
           </w:p>
         </w:tc>
@@ -1385,7 +1347,7 @@
           </w:tcPr>
           <w:p>
             <w:r>
-              <w:t>payrollEmployees → empleados_nomina</w:t>
+              <w:t>payrollEmployees</w:t>
             </w:r>
           </w:p>
         </w:tc>
@@ -1395,7 +1357,7 @@
           </w:tcPr>
           <w:p>
             <w:r>
-              <w:t>Incl. periodicidad_pago homologada con formulario alta</w:t>
+              <w:t>empleados_nomina.periodicidad_pago canónico `payFrequency`</w:t>
             </w:r>
           </w:p>
         </w:tc>
@@ -1407,7 +1369,7 @@
           </w:tcPr>
           <w:p>
             <w:r>
-              <w:t>payrollRuns → liquidaciones_nomina</w:t>
+              <w:t>payrollRuns</w:t>
             </w:r>
           </w:p>
         </w:tc>
@@ -1417,7 +1379,7 @@
           </w:tcPr>
           <w:p>
             <w:r>
-              <w:t>Conceptos legales CO, periodos YYYY-MM (+ sufijos cortes migr. 23)</w:t>
+              <w:t>liquidaciones_nomina (periodos extendidos migr.23)</w:t>
             </w:r>
           </w:p>
         </w:tc>
@@ -1429,220 +1391,7 @@
           </w:tcPr>
           <w:p>
             <w:r>
-              <w:t>hrAbsences → ausencias_laborales</w:t>
-            </w:r>
-          </w:p>
-        </w:tc>
-        <w:tc>
-          <w:tcPr>
-            <w:tcW w:type="dxa" w:w="4320"/>
-          </w:tcPr>
-          <w:p>
-            <w:r/>
-          </w:p>
-        </w:tc>
-      </w:tr>
-      <w:tr>
-        <w:tc>
-          <w:tcPr>
-            <w:tcW w:type="dxa" w:w="4320"/>
-          </w:tcPr>
-          <w:p>
-            <w:r>
-              <w:t>vacancies → vacantes</w:t>
-            </w:r>
-          </w:p>
-        </w:tc>
-        <w:tc>
-          <w:tcPr>
-            <w:tcW w:type="dxa" w:w="4320"/>
-          </w:tcPr>
-          <w:p>
-            <w:r/>
-          </w:p>
-        </w:tc>
-      </w:tr>
-      <w:tr>
-        <w:tc>
-          <w:tcPr>
-            <w:tcW w:type="dxa" w:w="4320"/>
-          </w:tcPr>
-          <w:p>
-            <w:r>
-              <w:t>candidates → candidatos</w:t>
-            </w:r>
-          </w:p>
-        </w:tc>
-        <w:tc>
-          <w:tcPr>
-            <w:tcW w:type="dxa" w:w="4320"/>
-          </w:tcPr>
-          <w:p>
-            <w:r/>
-          </w:p>
-        </w:tc>
-      </w:tr>
-      <w:tr>
-        <w:tc>
-          <w:tcPr>
-            <w:tcW w:type="dxa" w:w="4320"/>
-          </w:tcPr>
-          <w:p>
-            <w:r>
-              <w:t>interviews → entrevistas</w:t>
-            </w:r>
-          </w:p>
-        </w:tc>
-        <w:tc>
-          <w:tcPr>
-            <w:tcW w:type="dxa" w:w="4320"/>
-          </w:tcPr>
-          <w:p>
-            <w:r/>
-          </w:p>
-        </w:tc>
-      </w:tr>
-      <w:tr>
-        <w:tc>
-          <w:tcPr>
-            <w:tcW w:type="dxa" w:w="4320"/>
-          </w:tcPr>
-          <w:p>
-            <w:r>
-              <w:t>contracts → contratos</w:t>
-            </w:r>
-          </w:p>
-        </w:tc>
-        <w:tc>
-          <w:tcPr>
-            <w:tcW w:type="dxa" w:w="4320"/>
-          </w:tcPr>
-          <w:p>
-            <w:r/>
-          </w:p>
-        </w:tc>
-      </w:tr>
-      <w:tr>
-        <w:tc>
-          <w:tcPr>
-            <w:tcW w:type="dxa" w:w="4320"/>
-          </w:tcPr>
-          <w:p>
-            <w:r>
-              <w:t>positions → cargos</w:t>
-            </w:r>
-          </w:p>
-        </w:tc>
-        <w:tc>
-          <w:tcPr>
-            <w:tcW w:type="dxa" w:w="4320"/>
-          </w:tcPr>
-          <w:p>
-            <w:r/>
-          </w:p>
-        </w:tc>
-      </w:tr>
-      <w:tr>
-        <w:tc>
-          <w:tcPr>
-            <w:tcW w:type="dxa" w:w="4320"/>
-          </w:tcPr>
-          <w:p>
-            <w:r>
-              <w:t>approvals → solicitudes_autorizacion</w:t>
-            </w:r>
-          </w:p>
-        </w:tc>
-        <w:tc>
-          <w:tcPr>
-            <w:tcW w:type="dxa" w:w="4320"/>
-          </w:tcPr>
-          <w:p>
-            <w:r/>
-          </w:p>
-        </w:tc>
-      </w:tr>
-      <w:tr>
-        <w:tc>
-          <w:tcPr>
-            <w:tcW w:type="dxa" w:w="4320"/>
-          </w:tcPr>
-          <w:p>
-            <w:r>
-              <w:t>notifications → notificaciones</w:t>
-            </w:r>
-          </w:p>
-        </w:tc>
-        <w:tc>
-          <w:tcPr>
-            <w:tcW w:type="dxa" w:w="4320"/>
-          </w:tcPr>
-          <w:p>
-            <w:r/>
-          </w:p>
-        </w:tc>
-      </w:tr>
-      <w:tr>
-        <w:tc>
-          <w:tcPr>
-            <w:tcW w:type="dxa" w:w="4320"/>
-          </w:tcPr>
-          <w:p>
-            <w:r>
-              <w:t>tripRouteRates → tarifas_trayecto</w:t>
-            </w:r>
-          </w:p>
-        </w:tc>
-        <w:tc>
-          <w:tcPr>
-            <w:tcW w:type="dxa" w:w="4320"/>
-          </w:tcPr>
-          <w:p>
-            <w:r/>
-          </w:p>
-        </w:tc>
-      </w:tr>
-    </w:tbl>
-    <w:p>
-      <w:r>
-        <w:br w:type="page"/>
-      </w:r>
-    </w:p>
-    <w:p>
-      <w:pPr>
-        <w:pStyle w:val="Heading1"/>
-      </w:pPr>
-      <w:r>
-        <w:t>6. Modelo de datos (PostgreSQL — scripts `BD/postgres`)</w:t>
-      </w:r>
-    </w:p>
-    <w:p>
-      <w:r>
-        <w:rPr>
-          <w:b w:val="0"/>
-          <w:sz w:val="22"/>
-        </w:rPr>
-        <w:t>Los módulos DDL están segregados por dominio. Tipos ENUM en `02_enums.sql`. RLS opcional (`09_rls_tablas.sql`, `10_rls_storage_supabase.sql`). Comentarios en tablas relacionan cada entidad con la clave en el SPA.</w:t>
-      </w:r>
-    </w:p>
-    <w:tbl>
-      <w:tblPr>
-        <w:tblStyle w:val="TableGrid"/>
-        <w:tblW w:type="auto" w:w="0"/>
-        <w:tblLook w:firstColumn="1" w:firstRow="1" w:lastColumn="0" w:lastRow="0" w:noHBand="0" w:noVBand="1" w:val="04A0"/>
-      </w:tblPr>
-      <w:tblGrid>
-        <w:gridCol w:w="4320"/>
-        <w:gridCol w:w="4320"/>
-      </w:tblGrid>
-      <w:tr>
-        <w:tc>
-          <w:tcPr>
-            <w:tcW w:type="dxa" w:w="4320"/>
-          </w:tcPr>
-          <w:p>
-            <w:r>
-              <w:t>Archivo base</w:t>
+              <w:t>approvals</w:t>
             </w:r>
           </w:p>
         </w:tc>
@@ -1652,161 +1401,7 @@
           </w:tcPr>
           <w:p>
             <w:r>
-              <w:t>Contenido resumido</w:t>
-            </w:r>
-          </w:p>
-        </w:tc>
-      </w:tr>
-      <w:tr>
-        <w:tc>
-          <w:tcPr>
-            <w:tcW w:type="dxa" w:w="4320"/>
-          </w:tcPr>
-          <w:p>
-            <w:r>
-              <w:t>01_extensions.sql</w:t>
-            </w:r>
-          </w:p>
-        </w:tc>
-        <w:tc>
-          <w:tcPr>
-            <w:tcW w:type="dxa" w:w="4320"/>
-          </w:tcPr>
-          <w:p>
-            <w:r>
-              <w:t>Extensiones Postgres necesarias</w:t>
-            </w:r>
-          </w:p>
-        </w:tc>
-      </w:tr>
-      <w:tr>
-        <w:tc>
-          <w:tcPr>
-            <w:tcW w:type="dxa" w:w="4320"/>
-          </w:tcPr>
-          <w:p>
-            <w:r>
-              <w:t>02_enums.sql</w:t>
-            </w:r>
-          </w:p>
-        </w:tc>
-        <w:tc>
-          <w:tcPr>
-            <w:tcW w:type="dxa" w:w="4320"/>
-          </w:tcPr>
-          <w:p>
-            <w:r>
-              <w:t>Roles, estados solicitud/aprobación, etc.</w:t>
-            </w:r>
-          </w:p>
-        </w:tc>
-      </w:tr>
-      <w:tr>
-        <w:tc>
-          <w:tcPr>
-            <w:tcW w:type="dxa" w:w="4320"/>
-          </w:tcPr>
-          <w:p>
-            <w:r>
-              <w:t>03_nucleo_empresa_usuarios.sql</w:t>
-            </w:r>
-          </w:p>
-        </w:tc>
-        <w:tc>
-          <w:tcPr>
-            <w:tcW w:type="dxa" w:w="4320"/>
-          </w:tcPr>
-          <w:p>
-            <w:r>
-              <w:t>empresas, usuarios, permisos_usuario, reglas_viatico, parametros_sistema</w:t>
-            </w:r>
-          </w:p>
-        </w:tc>
-      </w:tr>
-      <w:tr>
-        <w:tc>
-          <w:tcPr>
-            <w:tcW w:type="dxa" w:w="4320"/>
-          </w:tcPr>
-          <w:p>
-            <w:r>
-              <w:t>04_transporte.sql</w:t>
-            </w:r>
-          </w:p>
-        </w:tc>
-        <w:tc>
-          <w:tcPr>
-            <w:tcW w:type="dxa" w:w="4320"/>
-          </w:tcPr>
-          <w:p>
-            <w:r>
-              <w:t>vehiculos, conductores, tarifas_trayecto, solicitudes_transporte, viajes_transporte, combustible/logs si aplica</w:t>
-            </w:r>
-          </w:p>
-        </w:tc>
-      </w:tr>
-      <w:tr>
-        <w:tc>
-          <w:tcPr>
-            <w:tcW w:type="dxa" w:w="4320"/>
-          </w:tcPr>
-          <w:p>
-            <w:r>
-              <w:t>05_rrhh.sql</w:t>
-            </w:r>
-          </w:p>
-        </w:tc>
-        <w:tc>
-          <w:tcPr>
-            <w:tcW w:type="dxa" w:w="4320"/>
-          </w:tcPr>
-          <w:p>
-            <w:r>
-              <w:t>cargos, vacantes, candidatos, entrevistas, contratos, empleados_nomina, liquidaciones_nomina, ausencias, SST</w:t>
-            </w:r>
-          </w:p>
-        </w:tc>
-      </w:tr>
-      <w:tr>
-        <w:tc>
-          <w:tcPr>
-            <w:tcW w:type="dxa" w:w="4320"/>
-          </w:tcPr>
-          <w:p>
-            <w:r>
-              <w:t>06_sistema.sql</w:t>
-            </w:r>
-          </w:p>
-        </w:tc>
-        <w:tc>
-          <w:tcPr>
-            <w:tcW w:type="dxa" w:w="4320"/>
-          </w:tcPr>
-          <w:p>
-            <w:r>
-              <w:t>notificaciones, correos_salida, prospectos B2B, contadores_secuencia, solicitudes_autorizacion, sesiones_usuario</w:t>
-            </w:r>
-          </w:p>
-        </w:tc>
-      </w:tr>
-      <w:tr>
-        <w:tc>
-          <w:tcPr>
-            <w:tcW w:type="dxa" w:w="4320"/>
-          </w:tcPr>
-          <w:p>
-            <w:r>
-              <w:t>Migraciones posteriores (15–23)</w:t>
-            </w:r>
-          </w:p>
-        </w:tc>
-        <w:tc>
-          <w:tcPr>
-            <w:tcW w:type="dxa" w:w="4320"/>
-          </w:tcPr>
-          <w:p>
-            <w:r>
-              <w:t>Aprobaciones admin, empresa activo tipo relación, columnas usuarios/registro, liquidación automática, periodos extendidos, etc.</w:t>
+              <w:t>solicitudes_autorizacion</w:t>
             </w:r>
           </w:p>
         </w:tc>
@@ -1816,9 +1411,8 @@
       <w:r>
         <w:rPr>
           <w:b w:val="0"/>
-          <w:sz w:val="22"/>
         </w:rPr>
-        <w:t>Nota: para `periodo_mes` extendido por periodicidad quincenal/semanal, aplicar migración 23 cuando corresponda; el motor de cortes opera en America/Bogota.</w:t>
+        <w:t>`PortalService.syncPayrollEmployees` normaliza etiquetas periodicidad mediante `canonicalPayFrequencyLabel` (archivo TS `apps/api/src/payroll/payroll-frequency.ts`) garantizando trazabilidad negocio↔motor liquidación.</w:t>
       </w:r>
     </w:p>
     <w:p>
@@ -1831,169 +1425,31 @@
         <w:pStyle w:val="Heading1"/>
       </w:pPr>
       <w:r>
-        <w:t>7. Mockups tipo wireframe (basados en la interfaz vigente)</w:t>
-      </w:r>
-    </w:p>
-    <w:p>
-      <w:r>
-        <w:rPr>
-          <w:b w:val="0"/>
-          <w:sz w:val="22"/>
-        </w:rPr>
-        <w:t>Texto monocolumna ASCII; pueden sustituirse en Word por capturas de pantalla reales del mismo layout.</w:t>
+        <w:t>6. Modelo físico DDL (extracto)</w:t>
       </w:r>
     </w:p>
     <w:p>
       <w:pPr>
-        <w:pStyle w:val="Heading2"/>
+        <w:pStyle w:val="ListBullet"/>
       </w:pPr>
       <w:r>
-        <w:t>7.1 Barra pública desktop</w:t>
-      </w:r>
-    </w:p>
-    <w:p>
-      <w:r>
-        <w:rPr>
-          <w:rFonts w:ascii="Consolas" w:hAnsi="Consolas"/>
-          <w:sz w:val="18"/>
-        </w:rPr>
-        <w:t xml:space="preserve"> +-----------------------------------------------------------------------------+</w:t>
-        <w:br/>
-        <w:t xml:space="preserve"> | [PNG Logo Antares …. ]   Inicio Nosotros … Contacto             ☀️ 🌙 🇨🇴 🇺🇸  [ Portal ]</w:t>
-        <w:br/>
-        <w:t xml:space="preserve"> +-----------------------------------------------------------------------------+</w:t>
-        <w:br/>
-        <w:t xml:space="preserve"> Fondo blur claro (#fff ~90% opacity), borde inferior sutil marca, links hover con fondo primary 9%.</w:t>
-        <w:br/>
+        <w:t>01_extensions.sql … 06_sistema.sql: núcleo, transporte, RRHH &amp; sistema.</w:t>
       </w:r>
     </w:p>
     <w:p>
       <w:pPr>
-        <w:pStyle w:val="Heading2"/>
+        <w:pStyle w:val="ListBullet"/>
       </w:pPr>
       <w:r>
-        <w:t>7.2 Hero</w:t>
-      </w:r>
-    </w:p>
-    <w:p>
-      <w:r>
-        <w:rPr>
-          <w:rFonts w:ascii="Consolas" w:hAnsi="Consolas"/>
-          <w:sz w:val="18"/>
-        </w:rPr>
-        <w:t xml:space="preserve"> +------------------------------------------------------------+</w:t>
-        <w:br/>
-        <w:t xml:space="preserve"> | ████ foto ruta/flora blur + overlay gradiente marca          |</w:t>
-        <w:br/>
-        <w:t xml:space="preserve"> |                                                               |</w:t>
-        <w:br/>
-        <w:t xml:space="preserve"> |  [ Logo grande panel glass ]   Kicker ⚡ texto                |</w:t>
-        <w:br/>
-        <w:t xml:space="preserve"> |                                 H1 dos líneas + acento cyan   |</w:t>
-        <w:br/>
-        <w:t xml:space="preserve"> |                                 párrafo                       |</w:t>
-        <w:br/>
-        <w:t xml:space="preserve"> |     [ Solicitar propuesta ]  [ Ingresar al portal ]          |</w:t>
-        <w:br/>
-        <w:t xml:space="preserve"> |     +----------+ +----------+ +----------+</w:t>
-        <w:br/>
-        <w:t xml:space="preserve"> |     | entregas | | cumpl.  | | &lt; 12 min |   (glass cards)</w:t>
-        <w:br/>
-        <w:t xml:space="preserve"> |     +----------+ +----------+ +----------+</w:t>
-        <w:br/>
-        <w:t xml:space="preserve"> +----------------------------------------------------------------+</w:t>
+        <w:t>Migraciones 15–23: registro empresa, políticas cuenta, automatización líquidos, períodos extendidos nómina.</w:t>
       </w:r>
     </w:p>
     <w:p>
       <w:pPr>
-        <w:pStyle w:val="Heading2"/>
+        <w:pStyle w:val="ListBullet"/>
       </w:pPr>
       <w:r>
-        <w:t>7.3 Sección institucional (grid 3 cards)</w:t>
-      </w:r>
-    </w:p>
-    <w:p>
-      <w:r>
-        <w:rPr>
-          <w:rFonts w:ascii="Consolas" w:hAnsi="Consolas"/>
-          <w:sz w:val="18"/>
-        </w:rPr>
-        <w:t xml:space="preserve"> +-----------------+  +-----------------+  +-----------------+</w:t>
-        <w:br/>
-        <w:t xml:space="preserve"> | [icon línea]    |  | [icon corazón]  |  | [icon escudo]   |</w:t>
-        <w:br/>
-        <w:t xml:space="preserve"> | H2 Quiénes …    |  | H2 Valores      |  | H2 Estándar     |</w:t>
-        <w:br/>
-        <w:t xml:space="preserve"> | texto/markdown  |  | lista bullets   |  | párrafo         |</w:t>
-        <w:br/>
-        <w:t xml:space="preserve"> +-----------------+  +-----------------+  +-----------------+</w:t>
-      </w:r>
-    </w:p>
-    <w:p>
-      <w:pPr>
-        <w:pStyle w:val="Heading2"/>
-      </w:pPr>
-      <w:r>
-        <w:t>7.4 Portal autenticado (shell)</w:t>
-      </w:r>
-    </w:p>
-    <w:p>
-      <w:r>
-        <w:rPr>
-          <w:rFonts w:ascii="Consolas" w:hAnsi="Consolas"/>
-          <w:sz w:val="18"/>
-        </w:rPr>
-        <w:t xml:space="preserve"> +----------------------------------------------------------+</w:t>
-        <w:br/>
-        <w:t xml:space="preserve"> | Barra contextual portal (nombre usuario, empresa, logout) |</w:t>
-        <w:br/>
-        <w:t xml:space="preserve"> +----------+-----------------------------------------------+</w:t>
-        <w:br/>
-        <w:t xml:space="preserve"> | Nav      | Area contenido: solicitudes | nómina | flota …     |</w:t>
-        <w:br/>
-        <w:t xml:space="preserve"> | (rol)    | dentro de .module-card / tablas responsive        |</w:t>
-        <w:br/>
-        <w:t xml:space="preserve"> |          | acciones btn-primary header                       |</w:t>
-        <w:br/>
-        <w:t xml:space="preserve"> +----------+-----------------------------------------------+</w:t>
-        <w:br/>
-        <w:t xml:space="preserve"> En móvil: backdrop oscuro cuando nav lateral / drawer abierto.</w:t>
-      </w:r>
-    </w:p>
-    <w:p>
-      <w:pPr>
-        <w:pStyle w:val="Heading2"/>
-      </w:pPr>
-      <w:r>
-        <w:t>7.5 Formulario alta empleado (fragmento RRHH)</w:t>
-      </w:r>
-    </w:p>
-    <w:p>
-      <w:r>
-        <w:rPr>
-          <w:rFonts w:ascii="Consolas" w:hAnsi="Consolas"/>
-          <w:sz w:val="18"/>
-        </w:rPr>
-        <w:t xml:space="preserve"> +-------------------------------------------------------+</w:t>
-        <w:br/>
-        <w:t xml:space="preserve"> | Datos personales                                      |</w:t>
-        <w:br/>
-        <w:t xml:space="preserve"> | nombre | tipo doc | N° doc | fecha nacimiento …       |</w:t>
-        <w:br/>
-        <w:t xml:space="preserve"> | cargo (select cargos activos) | contrato …            |</w:t>
-        <w:br/>
-        <w:t xml:space="preserve"> | …                                                      |</w:t>
-        <w:br/>
-        <w:t xml:space="preserve"> | Nómina: salario | auxilio transporte | Periodicidad ◄──┐</w:t>
-        <w:br/>
-        <w:t xml:space="preserve"> |    [ Mensual ▼ ][ Quincenal ][ Semanal ][ Catorcenal ]  │</w:t>
-        <w:br/>
-        <w:t xml:space="preserve"> | EPS | Pensión | ARL | Cesantías | …                    |</w:t>
-        <w:br/>
-        <w:t xml:space="preserve"> +-------------------------------------------------------+</w:t>
-        <w:br/>
-        <w:t xml:space="preserve"> El valor canonico en BD tras sync: periodicidad_pago = mismo texto catálogo.</w:t>
-        <w:br/>
+        <w:t>Opcional Supabase — RLS políticas declaradas pero activación dependiente de ambiente cliente.</w:t>
       </w:r>
     </w:p>
     <w:p>
@@ -2006,167 +1462,31 @@
         <w:pStyle w:val="Heading1"/>
       </w:pPr>
       <w:r>
-        <w:t>8. Flujos destacados desde UX</w:t>
-      </w:r>
-    </w:p>
-    <w:tbl>
-      <w:tblPr>
-        <w:tblStyle w:val="TableGrid"/>
-        <w:tblW w:type="auto" w:w="0"/>
-        <w:tblLook w:firstColumn="1" w:firstRow="1" w:lastColumn="0" w:lastRow="0" w:noHBand="0" w:noVBand="1" w:val="04A0"/>
-      </w:tblPr>
-      <w:tblGrid>
-        <w:gridCol w:w="4320"/>
-        <w:gridCol w:w="4320"/>
-      </w:tblGrid>
-      <w:tr>
-        <w:tc>
-          <w:tcPr>
-            <w:tcW w:type="dxa" w:w="4320"/>
-          </w:tcPr>
-          <w:p>
-            <w:r>
-              <w:t>Flujo</w:t>
-            </w:r>
-          </w:p>
-        </w:tc>
-        <w:tc>
-          <w:tcPr>
-            <w:tcW w:type="dxa" w:w="4320"/>
-          </w:tcPr>
-          <w:p>
-            <w:r>
-              <w:t>Puntos UI</w:t>
-            </w:r>
-          </w:p>
-        </w:tc>
-      </w:tr>
-      <w:tr>
-        <w:tc>
-          <w:tcPr>
-            <w:tcW w:type="dxa" w:w="4320"/>
-          </w:tcPr>
-          <w:p>
-            <w:r>
-              <w:t>Registro cliente</w:t>
-            </w:r>
-          </w:p>
-        </w:tc>
-        <w:tc>
-          <w:tcPr>
-            <w:tcW w:type="dxa" w:w="4320"/>
-          </w:tcPr>
-          <w:p>
-            <w:r>
-              <w:t>Form auth + Turnstile; checklist términos; posible cuenta pendiente de aprobación</w:t>
-            </w:r>
-          </w:p>
-        </w:tc>
-      </w:tr>
-      <w:tr>
-        <w:tc>
-          <w:tcPr>
-            <w:tcW w:type="dxa" w:w="4320"/>
-          </w:tcPr>
-          <w:p>
-            <w:r>
-              <w:t>Nueva solicitud transporte</w:t>
-            </w:r>
-          </w:p>
-        </w:tc>
-        <w:tc>
-          <w:tcPr>
-            <w:tcW w:type="dxa" w:w="4320"/>
-          </w:tcPr>
-          <w:p>
-            <w:r>
-              <w:t>Wizard fechas/ciudades/tonelaje; cliente ve estados Pendiente/Aprobado…</w:t>
-            </w:r>
-          </w:p>
-        </w:tc>
-      </w:tr>
-      <w:tr>
-        <w:tc>
-          <w:tcPr>
-            <w:tcW w:type="dxa" w:w="4320"/>
-          </w:tcPr>
-          <w:p>
-            <w:r>
-              <w:t>Aprobación admin</w:t>
-            </w:r>
-          </w:p>
-        </w:tc>
-        <w:tc>
-          <w:tcPr>
-            <w:tcW w:type="dxa" w:w="4320"/>
-          </w:tcPr>
-          <w:p>
-            <w:r>
-              <w:t>`solicitudes_autorizacion` + vistas cola bandeja portal</w:t>
-            </w:r>
-          </w:p>
-        </w:tc>
-      </w:tr>
-      <w:tr>
-        <w:tc>
-          <w:tcPr>
-            <w:tcW w:type="dxa" w:w="4320"/>
-          </w:tcPr>
-          <w:p>
-            <w:r>
-              <w:t>Nómina automática</w:t>
-            </w:r>
-          </w:p>
-        </w:tc>
-        <w:tc>
-          <w:tcPr>
-            <w:tcW w:type="dxa" w:w="4320"/>
-          </w:tcPr>
-          <w:p>
-            <w:r>
-              <w:t>Cron Bogotá; cortes por periodicidad desde `empleados_nomina.periodicidad_pago`</w:t>
-            </w:r>
-          </w:p>
-        </w:tc>
-      </w:tr>
-      <w:tr>
-        <w:tc>
-          <w:tcPr>
-            <w:tcW w:type="dxa" w:w="4320"/>
-          </w:tcPr>
-          <w:p>
-            <w:r>
-              <w:t>Tema idioma</w:t>
-            </w:r>
-          </w:p>
-        </w:tc>
-        <w:tc>
-          <w:tcPr>
-            <w:tcW w:type="dxa" w:w="4320"/>
-          </w:tcPr>
-          <w:p>
-            <w:r>
-              <w:t>Toggle persistente antes de cargar vistas</w:t>
-            </w:r>
-          </w:p>
-        </w:tc>
-      </w:tr>
-    </w:tbl>
-    <w:p>
-      <w:pPr>
-        <w:pStyle w:val="Heading1"/>
-      </w:pPr>
-      <w:r>
-        <w:t>9. Roadmap técnico sugerido (no implementado fuera de código)</w:t>
+        <w:t>7. Supuestos, limitaciones conocidas</w:t>
       </w:r>
     </w:p>
     <w:p>
+      <w:pPr>
+        <w:pStyle w:val="ListBullet"/>
+      </w:pPr>
       <w:r>
-        <w:rPr>
-          <w:b w:val="0"/>
-          <w:sz w:val="22"/>
-        </w:rPr>
-        <w:t xml:space="preserve">(1) Unificar totalmente SPA y `apps/web` o documentar públicamente cuál es canónico. (2) Storybook o guía CSS de tokens exportados desde `styles.css`. (3) Capturas profesionales en este documento. (4) Diagrama ER automatizado desde migraciones. </w:t>
+        <w:t>Se documenta SPA raíz dominante (`index.html`): `apps/web` Next coexist sin ser la experiencia canónica hoy día.</w:t>
+      </w:r>
+    </w:p>
+    <w:p>
+      <w:pPr>
+        <w:pStyle w:val="ListBullet"/>
+      </w:pPr>
+      <w:r>
+        <w:t>Diagramas sintéticos: no muestran despliegue multi-región/geo-HA hasta que proyecto lo compre.</w:t>
+      </w:r>
+    </w:p>
+    <w:p>
+      <w:pPr>
+        <w:pStyle w:val="ListBullet"/>
+      </w:pPr>
+      <w:r>
+        <w:t>No sustituye pruebas carga PEN nor formal threat modeling — son insumos de arranque comité técnico.</w:t>
       </w:r>
     </w:p>
     <w:p>
@@ -2174,7 +1494,7 @@
         <w:pStyle w:val="Heading1"/>
       </w:pPr>
       <w:r>
-        <w:t>10. Glosario</w:t>
+        <w:t>8. Glosario</w:t>
       </w:r>
     </w:p>
     <w:tbl>
@@ -2204,7 +1524,7 @@
           </w:tcPr>
           <w:p>
             <w:r>
-              <w:t>Significado en Antares</w:t>
+              <w:t>Sentido proyecto</w:t>
             </w:r>
           </w:p>
         </w:tc>
@@ -2216,7 +1536,7 @@
           </w:tcPr>
           <w:p>
             <w:r>
-              <w:t>KEYS.* / localStorage</w:t>
+              <w:t>AS-IS / TO-BE</w:t>
             </w:r>
           </w:p>
         </w:tc>
@@ -2226,7 +1546,29 @@
           </w:tcPr>
           <w:p>
             <w:r>
-              <w:t>Sincronización con filas servidor y caché local</w:t>
+              <w:t>AS-IS = snapshot fuente disponible.</w:t>
+            </w:r>
+          </w:p>
+        </w:tc>
+      </w:tr>
+      <w:tr>
+        <w:tc>
+          <w:tcPr>
+            <w:tcW w:type="dxa" w:w="4320"/>
+          </w:tcPr>
+          <w:p>
+            <w:r>
+              <w:t>KEYS.*</w:t>
+            </w:r>
+          </w:p>
+        </w:tc>
+        <w:tc>
+          <w:tcPr>
+            <w:tcW w:type="dxa" w:w="4320"/>
+          </w:tcPr>
+          <w:p>
+            <w:r>
+              <w:t>Estructuras JSON colección UI cache localStorage antes sync.</w:t>
             </w:r>
           </w:p>
         </w:tc>
@@ -2248,73 +1590,7 @@
           </w:tcPr>
           <w:p>
             <w:r>
-              <w:t>Hidratación inicial desde API después del login</w:t>
-            </w:r>
-          </w:p>
-        </w:tc>
-      </w:tr>
-      <w:tr>
-        <w:tc>
-          <w:tcPr>
-            <w:tcW w:type="dxa" w:w="4320"/>
-          </w:tcPr>
-          <w:p>
-            <w:r>
-              <w:t>periodicity / payFrequency / periodicidad_pago</w:t>
-            </w:r>
-          </w:p>
-        </w:tc>
-        <w:tc>
-          <w:tcPr>
-            <w:tcW w:type="dxa" w:w="4320"/>
-          </w:tcPr>
-          <w:p>
-            <w:r>
-              <w:t>Misma nómina: etiquetas Mensual–Catorcenal</w:t>
-            </w:r>
-          </w:p>
-        </w:tc>
-      </w:tr>
-      <w:tr>
-        <w:tc>
-          <w:tcPr>
-            <w:tcW w:type="dxa" w:w="4320"/>
-          </w:tcPr>
-          <w:p>
-            <w:r>
-              <w:t>periodo_mes</w:t>
-            </w:r>
-          </w:p>
-        </w:tc>
-        <w:tc>
-          <w:tcPr>
-            <w:tcW w:type="dxa" w:w="4320"/>
-          </w:tcPr>
-          <w:p>
-            <w:r>
-              <w:t>clave periodo fiscal de liquidación incl. sufijos cortes cuando migración 23 aplique</w:t>
-            </w:r>
-          </w:p>
-        </w:tc>
-      </w:tr>
-      <w:tr>
-        <w:tc>
-          <w:tcPr>
-            <w:tcW w:type="dxa" w:w="4320"/>
-          </w:tcPr>
-          <w:p>
-            <w:r>
-              <w:t>Glass card</w:t>
-            </w:r>
-          </w:p>
-        </w:tc>
-        <w:tc>
-          <w:tcPr>
-            <w:tcW w:type="dxa" w:w="4320"/>
-          </w:tcPr>
-          <w:p>
-            <w:r>
-              <w:t>Panel semitranslúcido con blur ligero en hero/estadística</w:t>
+              <w:t>`/portal/bootstrap` hidratar usuario y listas servidor.</w:t>
             </w:r>
           </w:p>
         </w:tc>
@@ -2323,18 +1599,14 @@
     <w:p>
       <w:r>
         <w:rPr>
-          <w:b w:val="0"/>
-          <w:sz w:val="22"/>
+          <w:rFonts w:ascii="Consolas" w:hAnsi="Consolas"/>
+          <w:sz w:val="16"/>
         </w:rPr>
-      </w:r>
-    </w:p>
-    <w:p>
-      <w:r>
-        <w:rPr>
-          <w:b w:val="0"/>
-          <w:sz w:val="22"/>
-        </w:rPr>
-        <w:t>Archivo generado automáticamente por `docs/generar_arquitectura_uiux.py` → `Antares_Arquitectura_UI_UX.docx`.</w:t>
+        <w:t>DOCX: C:\Users\User\Documents\Antares Nuevo\docs\Antares_Arquitectura_UI_UX.docx</w:t>
+        <w:br/>
+        <w:t>FIGURAS: C:\Users\User\Documents\Antares Nuevo\docs\_diagramas_antares_build</w:t>
+        <w:br/>
+        <w:t>Script: C:\Users\User\Documents\Antares Nuevo\docs\generar_arquitectura_uiux.py — PDF se intenta después de cerrar DOCX.</w:t>
       </w:r>
     </w:p>
     <w:sectPr>

</xml_diff>